<commit_message>
fix: align revision theory and submission package
</commit_message>
<xml_diff>
--- a/paper/revision_submission/Title_Page_revised.docx
+++ b/paper/revision_submission/Title_Page_revised.docx
@@ -1,6 +1,6 @@
 
 <file path=word/document.xml><?xml version="1.0" encoding="utf-8"?>
-<w:document xmlns:ns1="http://schemas.openxmlformats.org/markup-compatibility/2006" xmlns:ns2="http://schemas.microsoft.com/office/word/2010/wordml" xmlns:w="http://schemas.openxmlformats.org/wordprocessingml/2006/main" ns1:Ignorable="w14 w15 wp14">
+<w:document xmlns:ns1="http://schemas.openxmlformats.org/markup-compatibility/2006" xmlns:ns2="http://schemas.microsoft.com/office/word/2010/wordml" xmlns:r="http://schemas.openxmlformats.org/officeDocument/2006/relationships" xmlns:w="http://schemas.openxmlformats.org/wordprocessingml/2006/main" ns1:Ignorable="w14 w15 wp14">
   <w:body>
     <w:p ns2:paraId="5FE5D05F">
       <w:pPr>
@@ -553,7 +553,28 @@
           <w:i w:val="0"/>
           <w:sz w:val="20"/>
         </w:rPr>
-        <w:t>The source code, simulation scripts, benchmark results, plotting scripts, derived plant-historian metrics, and anonymized controller-export excerpts are available at https://github.com/VickylastShao/Robust-HOCBF-Safety-Filtering-for-Supercritical-Power-Plants-under-Model-Mismatch.</w:t>
+        <w:t xml:space="preserve">The source code, simulation scripts, benchmark results, plotting scripts, derived plant-historian metrics, and bounded controller-export excerpts are available at </w:t>
+      </w:r>
+      <w:hyperlink r:id="rId9">
+        <w:r>
+          <w:rPr>
+            <w:rFonts w:ascii="Times New Roman" w:hAnsi="Times New Roman" w:eastAsia="Times New Roman" w:cs="Times New Roman"/>
+            <w:b w:val="0"/>
+            <w:i w:val="0"/>
+            <w:sz w:val="20"/>
+            <w:rStyle w:val="Hyperlink"/>
+          </w:rPr>
+          <w:t>https://github.com/VickylastShao/Robust-HOCBF-Safety-Filtering-for-Supercritical-Power-Plants-under-Model-Mismatch</w:t>
+        </w:r>
+      </w:hyperlink>
+      <w:r>
+        <w:rPr>
+          <w:rFonts w:ascii="Times New Roman" w:hAnsi="Times New Roman" w:eastAsia="Times New Roman" w:cs="Times New Roman"/>
+          <w:b w:val="0"/>
+          <w:i w:val="0"/>
+          <w:sz w:val="20"/>
+        </w:rPr>
+        <w:t>.</w:t>
       </w:r>
     </w:p>
     <w:p ns2:paraId="11381CFB">
@@ -709,7 +730,7 @@
           <w:i w:val="0"/>
           <w:sz w:val="20"/>
         </w:rPr>
-        <w:t>8630</w:t>
+        <w:t>8874</w:t>
       </w:r>
     </w:p>
     <w:p ns2:paraId="7EBF1879">

</xml_diff>

<commit_message>
paper: finalize visual and document QA
</commit_message>
<xml_diff>
--- a/paper/revision_submission/Title_Page_revised.docx
+++ b/paper/revision_submission/Title_Page_revised.docx
@@ -730,7 +730,7 @@
           <w:i w:val="0"/>
           <w:sz w:val="20"/>
         </w:rPr>
-        <w:t>10089</w:t>
+        <w:t>10087</w:t>
       </w:r>
     </w:p>
     <w:p ns2:paraId="7EBF1879">
@@ -14168,14 +14168,4 @@
     </ns0:lnDef>
   </ns0:objectDefaults>
 </ns0:theme>
-</file>
-
-<file path=customXml/item1.xml><?xml version="1.0" encoding="utf-8"?>
-<b:Sources xmlns:b="http://schemas.openxmlformats.org/officeDocument/2006/bibliography" xmlns="http://schemas.openxmlformats.org/officeDocument/2006/bibliography" SelectedStyle="/APA.XSL" StyleName="APA"/>
-</file>
-
-<file path=customXml/itemProps1.xml><?xml version="1.0" encoding="utf-8"?>
-<ds:datastoreItem xmlns:ds="http://schemas.openxmlformats.org/officeDocument/2006/customXml" ds:itemID="{EF278816-EC6F-A645-907D-7F25AECB1D4A}">
-  <ds:schemaRefs/>
-</ds:datastoreItem>
 </file>
</xml_diff>